<commit_message>
feat: add star schema DDL script and update repository documentation
</commit_message>
<xml_diff>
--- a/docs/Documento.docx
+++ b/docs/Documento.docx
@@ -440,6 +440,9 @@
               <w:jc w:val="both"/>
             </w:pPr>
             <w:r>
+              <w:t>Is_</w:t>
+            </w:r>
+            <w:r>
               <w:t>hired</w:t>
             </w:r>
           </w:p>
@@ -835,12 +838,164 @@
     </w:p>
     <w:p>
       <w:pPr>
-        <w:jc w:val="both"/>
-      </w:pPr>
-    </w:p>
-    <w:p>
-      <w:pPr>
-        <w:jc w:val="both"/>
+        <w:spacing w:after="0" w:line="240" w:lineRule="auto"/>
+      </w:pPr>
+      <w:r>
+        <w:drawing>
+          <wp:anchor distT="0" distB="0" distL="114300" distR="114300" simplePos="0" relativeHeight="251658240" behindDoc="1" locked="0" layoutInCell="1" allowOverlap="1" wp14:anchorId="28D39514" wp14:editId="034129C0">
+            <wp:simplePos x="0" y="0"/>
+            <wp:positionH relativeFrom="column">
+              <wp:posOffset>1051016</wp:posOffset>
+            </wp:positionH>
+            <wp:positionV relativeFrom="paragraph">
+              <wp:posOffset>54338</wp:posOffset>
+            </wp:positionV>
+            <wp:extent cx="3849844" cy="2984863"/>
+            <wp:effectExtent l="0" t="0" r="0" b="0"/>
+            <wp:wrapNone/>
+            <wp:docPr id="1630845209" name="Picture 1"/>
+            <wp:cNvGraphicFramePr>
+              <a:graphicFrameLocks xmlns:a="http://schemas.openxmlformats.org/drawingml/2006/main" noChangeAspect="1"/>
+            </wp:cNvGraphicFramePr>
+            <a:graphic xmlns:a="http://schemas.openxmlformats.org/drawingml/2006/main">
+              <a:graphicData uri="http://schemas.openxmlformats.org/drawingml/2006/picture">
+                <pic:pic xmlns:pic="http://schemas.openxmlformats.org/drawingml/2006/picture">
+                  <pic:nvPicPr>
+                    <pic:cNvPr id="1630845209" name=""/>
+                    <pic:cNvPicPr/>
+                  </pic:nvPicPr>
+                  <pic:blipFill>
+                    <a:blip r:embed="rId5" cstate="print">
+                      <a:extLst>
+                        <a:ext uri="{28A0092B-C50C-407E-A947-70E740481C1C}">
+                          <a14:useLocalDpi xmlns:a14="http://schemas.microsoft.com/office/drawing/2010/main" val="0"/>
+                        </a:ext>
+                      </a:extLst>
+                    </a:blip>
+                    <a:stretch>
+                      <a:fillRect/>
+                    </a:stretch>
+                  </pic:blipFill>
+                  <pic:spPr>
+                    <a:xfrm>
+                      <a:off x="0" y="0"/>
+                      <a:ext cx="3849844" cy="2984863"/>
+                    </a:xfrm>
+                    <a:prstGeom prst="rect">
+                      <a:avLst/>
+                    </a:prstGeom>
+                  </pic:spPr>
+                </pic:pic>
+              </a:graphicData>
+            </a:graphic>
+            <wp14:sizeRelH relativeFrom="page">
+              <wp14:pctWidth>0</wp14:pctWidth>
+            </wp14:sizeRelH>
+            <wp14:sizeRelV relativeFrom="page">
+              <wp14:pctHeight>0</wp14:pctHeight>
+            </wp14:sizeRelV>
+          </wp:anchor>
+        </w:drawing>
+      </w:r>
+    </w:p>
+    <w:p>
+      <w:pPr>
+        <w:spacing w:after="0" w:line="240" w:lineRule="auto"/>
+      </w:pPr>
+    </w:p>
+    <w:p>
+      <w:pPr>
+        <w:spacing w:after="0" w:line="240" w:lineRule="auto"/>
+      </w:pPr>
+    </w:p>
+    <w:p>
+      <w:pPr>
+        <w:spacing w:after="0" w:line="240" w:lineRule="auto"/>
+      </w:pPr>
+    </w:p>
+    <w:p>
+      <w:pPr>
+        <w:spacing w:after="0" w:line="240" w:lineRule="auto"/>
+      </w:pPr>
+    </w:p>
+    <w:p>
+      <w:pPr>
+        <w:spacing w:after="0" w:line="240" w:lineRule="auto"/>
+      </w:pPr>
+    </w:p>
+    <w:p>
+      <w:pPr>
+        <w:spacing w:after="0" w:line="240" w:lineRule="auto"/>
+      </w:pPr>
+    </w:p>
+    <w:p>
+      <w:pPr>
+        <w:spacing w:after="0" w:line="240" w:lineRule="auto"/>
+      </w:pPr>
+    </w:p>
+    <w:p>
+      <w:pPr>
+        <w:spacing w:after="0" w:line="240" w:lineRule="auto"/>
+      </w:pPr>
+    </w:p>
+    <w:p>
+      <w:pPr>
+        <w:spacing w:after="0" w:line="240" w:lineRule="auto"/>
+      </w:pPr>
+    </w:p>
+    <w:p>
+      <w:pPr>
+        <w:spacing w:after="0" w:line="240" w:lineRule="auto"/>
+      </w:pPr>
+    </w:p>
+    <w:p>
+      <w:pPr>
+        <w:spacing w:after="0" w:line="240" w:lineRule="auto"/>
+      </w:pPr>
+    </w:p>
+    <w:p>
+      <w:pPr>
+        <w:spacing w:after="0" w:line="240" w:lineRule="auto"/>
+      </w:pPr>
+    </w:p>
+    <w:p>
+      <w:pPr>
+        <w:spacing w:after="0" w:line="240" w:lineRule="auto"/>
+      </w:pPr>
+    </w:p>
+    <w:p>
+      <w:pPr>
+        <w:spacing w:after="0" w:line="240" w:lineRule="auto"/>
+      </w:pPr>
+    </w:p>
+    <w:p>
+      <w:pPr>
+        <w:spacing w:after="0" w:line="240" w:lineRule="auto"/>
+      </w:pPr>
+    </w:p>
+    <w:p>
+      <w:pPr>
+        <w:spacing w:after="0" w:line="240" w:lineRule="auto"/>
+      </w:pPr>
+    </w:p>
+    <w:p>
+      <w:pPr>
+        <w:spacing w:after="0" w:line="240" w:lineRule="auto"/>
+      </w:pPr>
+    </w:p>
+    <w:p>
+      <w:pPr>
+        <w:spacing w:after="0" w:line="240" w:lineRule="auto"/>
+      </w:pPr>
+    </w:p>
+    <w:p>
+      <w:pPr>
+        <w:spacing w:after="0" w:line="240" w:lineRule="auto"/>
+      </w:pPr>
+    </w:p>
+    <w:p>
+      <w:pPr>
+        <w:spacing w:after="0" w:line="240" w:lineRule="auto"/>
       </w:pPr>
     </w:p>
     <w:sectPr>
@@ -856,6 +1011,155 @@
 <file path=word/numbering.xml><?xml version="1.0" encoding="utf-8"?>
 <w:numbering xmlns:wpc="http://schemas.microsoft.com/office/word/2010/wordprocessingCanvas" xmlns:cx="http://schemas.microsoft.com/office/drawing/2014/chartex" xmlns:cx1="http://schemas.microsoft.com/office/drawing/2015/9/8/chartex" xmlns:cx2="http://schemas.microsoft.com/office/drawing/2015/10/21/chartex" xmlns:cx3="http://schemas.microsoft.com/office/drawing/2016/5/9/chartex" xmlns:cx4="http://schemas.microsoft.com/office/drawing/2016/5/10/chartex" xmlns:cx5="http://schemas.microsoft.com/office/drawing/2016/5/11/chartex" xmlns:cx6="http://schemas.microsoft.com/office/drawing/2016/5/12/chartex" xmlns:cx7="http://schemas.microsoft.com/office/drawing/2016/5/13/chartex" xmlns:cx8="http://schemas.microsoft.com/office/drawing/2016/5/14/chartex" xmlns:mc="http://schemas.openxmlformats.org/markup-compatibility/2006" xmlns:m="http://schemas.openxmlformats.org/officeDocument/2006/math" xmlns:aink="http://schemas.microsoft.com/office/drawing/2016/ink" xmlns:am3d="http://schemas.microsoft.com/office/drawing/2017/model3d" xmlns:oel="http://schemas.microsoft.com/office/2019/extlst" xmlns:r="http://schemas.openxmlformats.org/officeDocument/2006/relationships" xmlns:wp14="http://schemas.microsoft.com/office/word/2010/wordprocessingDrawing" xmlns:wp="http://schemas.openxmlformats.org/drawingml/2006/wordprocessingDrawing" xmlns:wpg="http://schemas.microsoft.com/office/word/2010/wordprocessingGroup" xmlns:wpi="http://schemas.microsoft.com/office/word/2010/wordprocessingInk" xmlns:wps="http://schemas.microsoft.com/office/word/2010/wordprocessingShape" xmlns:o="urn:schemas-microsoft-com:office:office" xmlns:v="urn:schemas-microsoft-com:vml" xmlns:w10="urn:schemas-microsoft-com:office:word" xmlns:w="http://schemas.openxmlformats.org/wordprocessingml/2006/main" xmlns:w14="http://schemas.microsoft.com/office/word/2010/wordml" xmlns:w15="http://schemas.microsoft.com/office/word/2012/wordml" xmlns:w16cex="http://schemas.microsoft.com/office/word/2018/wordml/cex" xmlns:w16cid="http://schemas.microsoft.com/office/word/2016/wordml/cid" xmlns:w16="http://schemas.microsoft.com/office/word/2018/wordml" xmlns:w16sdtdh="http://schemas.microsoft.com/office/word/2020/wordml/sdtdatahash" xmlns:w16sdtfl="http://schemas.microsoft.com/office/word/2024/wordml/sdtformatlock" xmlns:w16se="http://schemas.microsoft.com/office/word/2015/wordml/symex" xmlns:w16du="http://schemas.microsoft.com/office/word/2023/wordml/word16du" xmlns:wne="http://schemas.microsoft.com/office/word/2006/wordml" mc:Ignorable="w14 w15 w16se w16cid w16 w16cex w16sdtdh w16sdtfl w16du wp14">
   <w:abstractNum w:abstractNumId="0" w15:restartNumberingAfterBreak="0">
+    <w:nsid w:val="6C5553C0"/>
+    <w:multiLevelType w:val="multilevel"/>
+    <w:tmpl w:val="7C343BAE"/>
+    <w:lvl w:ilvl="0">
+      <w:start w:val="1"/>
+      <w:numFmt w:val="bullet"/>
+      <w:lvlText w:val=""/>
+      <w:lvlJc w:val="left"/>
+      <w:pPr>
+        <w:tabs>
+          <w:tab w:val="num" w:pos="720"/>
+        </w:tabs>
+        <w:ind w:left="720" w:hanging="360"/>
+      </w:pPr>
+      <w:rPr>
+        <w:rFonts w:ascii="Symbol" w:hAnsi="Symbol" w:hint="default"/>
+        <w:sz w:val="20"/>
+      </w:rPr>
+    </w:lvl>
+    <w:lvl w:ilvl="1" w:tentative="1">
+      <w:start w:val="1"/>
+      <w:numFmt w:val="bullet"/>
+      <w:lvlText w:val="o"/>
+      <w:lvlJc w:val="left"/>
+      <w:pPr>
+        <w:tabs>
+          <w:tab w:val="num" w:pos="1440"/>
+        </w:tabs>
+        <w:ind w:left="1440" w:hanging="360"/>
+      </w:pPr>
+      <w:rPr>
+        <w:rFonts w:ascii="Courier New" w:hAnsi="Courier New" w:hint="default"/>
+        <w:sz w:val="20"/>
+      </w:rPr>
+    </w:lvl>
+    <w:lvl w:ilvl="2" w:tentative="1">
+      <w:start w:val="1"/>
+      <w:numFmt w:val="bullet"/>
+      <w:lvlText w:val=""/>
+      <w:lvlJc w:val="left"/>
+      <w:pPr>
+        <w:tabs>
+          <w:tab w:val="num" w:pos="2160"/>
+        </w:tabs>
+        <w:ind w:left="2160" w:hanging="360"/>
+      </w:pPr>
+      <w:rPr>
+        <w:rFonts w:ascii="Wingdings" w:hAnsi="Wingdings" w:hint="default"/>
+        <w:sz w:val="20"/>
+      </w:rPr>
+    </w:lvl>
+    <w:lvl w:ilvl="3" w:tentative="1">
+      <w:start w:val="1"/>
+      <w:numFmt w:val="bullet"/>
+      <w:lvlText w:val=""/>
+      <w:lvlJc w:val="left"/>
+      <w:pPr>
+        <w:tabs>
+          <w:tab w:val="num" w:pos="2880"/>
+        </w:tabs>
+        <w:ind w:left="2880" w:hanging="360"/>
+      </w:pPr>
+      <w:rPr>
+        <w:rFonts w:ascii="Wingdings" w:hAnsi="Wingdings" w:hint="default"/>
+        <w:sz w:val="20"/>
+      </w:rPr>
+    </w:lvl>
+    <w:lvl w:ilvl="4" w:tentative="1">
+      <w:start w:val="1"/>
+      <w:numFmt w:val="bullet"/>
+      <w:lvlText w:val=""/>
+      <w:lvlJc w:val="left"/>
+      <w:pPr>
+        <w:tabs>
+          <w:tab w:val="num" w:pos="3600"/>
+        </w:tabs>
+        <w:ind w:left="3600" w:hanging="360"/>
+      </w:pPr>
+      <w:rPr>
+        <w:rFonts w:ascii="Wingdings" w:hAnsi="Wingdings" w:hint="default"/>
+        <w:sz w:val="20"/>
+      </w:rPr>
+    </w:lvl>
+    <w:lvl w:ilvl="5" w:tentative="1">
+      <w:start w:val="1"/>
+      <w:numFmt w:val="bullet"/>
+      <w:lvlText w:val=""/>
+      <w:lvlJc w:val="left"/>
+      <w:pPr>
+        <w:tabs>
+          <w:tab w:val="num" w:pos="4320"/>
+        </w:tabs>
+        <w:ind w:left="4320" w:hanging="360"/>
+      </w:pPr>
+      <w:rPr>
+        <w:rFonts w:ascii="Wingdings" w:hAnsi="Wingdings" w:hint="default"/>
+        <w:sz w:val="20"/>
+      </w:rPr>
+    </w:lvl>
+    <w:lvl w:ilvl="6" w:tentative="1">
+      <w:start w:val="1"/>
+      <w:numFmt w:val="bullet"/>
+      <w:lvlText w:val=""/>
+      <w:lvlJc w:val="left"/>
+      <w:pPr>
+        <w:tabs>
+          <w:tab w:val="num" w:pos="5040"/>
+        </w:tabs>
+        <w:ind w:left="5040" w:hanging="360"/>
+      </w:pPr>
+      <w:rPr>
+        <w:rFonts w:ascii="Wingdings" w:hAnsi="Wingdings" w:hint="default"/>
+        <w:sz w:val="20"/>
+      </w:rPr>
+    </w:lvl>
+    <w:lvl w:ilvl="7" w:tentative="1">
+      <w:start w:val="1"/>
+      <w:numFmt w:val="bullet"/>
+      <w:lvlText w:val=""/>
+      <w:lvlJc w:val="left"/>
+      <w:pPr>
+        <w:tabs>
+          <w:tab w:val="num" w:pos="5760"/>
+        </w:tabs>
+        <w:ind w:left="5760" w:hanging="360"/>
+      </w:pPr>
+      <w:rPr>
+        <w:rFonts w:ascii="Wingdings" w:hAnsi="Wingdings" w:hint="default"/>
+        <w:sz w:val="20"/>
+      </w:rPr>
+    </w:lvl>
+    <w:lvl w:ilvl="8" w:tentative="1">
+      <w:start w:val="1"/>
+      <w:numFmt w:val="bullet"/>
+      <w:lvlText w:val=""/>
+      <w:lvlJc w:val="left"/>
+      <w:pPr>
+        <w:tabs>
+          <w:tab w:val="num" w:pos="6480"/>
+        </w:tabs>
+        <w:ind w:left="6480" w:hanging="360"/>
+      </w:pPr>
+      <w:rPr>
+        <w:rFonts w:ascii="Wingdings" w:hAnsi="Wingdings" w:hint="default"/>
+        <w:sz w:val="20"/>
+      </w:rPr>
+    </w:lvl>
+  </w:abstractNum>
+  <w:abstractNum w:abstractNumId="1" w15:restartNumberingAfterBreak="0">
     <w:nsid w:val="70163E23"/>
     <w:multiLevelType w:val="multilevel"/>
     <w:tmpl w:val="0409001D"/>
@@ -941,7 +1245,7 @@
       </w:pPr>
     </w:lvl>
   </w:abstractNum>
-  <w:abstractNum w:abstractNumId="1" w15:restartNumberingAfterBreak="0">
+  <w:abstractNum w:abstractNumId="2" w15:restartNumberingAfterBreak="0">
     <w:nsid w:val="73763A35"/>
     <w:multiLevelType w:val="hybridMultilevel"/>
     <w:tmpl w:val="BED2367C"/>
@@ -1054,7 +1358,7 @@
       </w:rPr>
     </w:lvl>
   </w:abstractNum>
-  <w:abstractNum w:abstractNumId="2" w15:restartNumberingAfterBreak="0">
+  <w:abstractNum w:abstractNumId="3" w15:restartNumberingAfterBreak="0">
     <w:nsid w:val="7519172A"/>
     <w:multiLevelType w:val="hybridMultilevel"/>
     <w:tmpl w:val="C9568224"/>
@@ -1141,12 +1445,15 @@
     </w:lvl>
   </w:abstractNum>
   <w:num w:numId="1" w16cid:durableId="1694914675">
+    <w:abstractNumId w:val="2"/>
+  </w:num>
+  <w:num w:numId="2" w16cid:durableId="248853773">
+    <w:abstractNumId w:val="3"/>
+  </w:num>
+  <w:num w:numId="3" w16cid:durableId="1641038858">
     <w:abstractNumId w:val="1"/>
   </w:num>
-  <w:num w:numId="2" w16cid:durableId="248853773">
-    <w:abstractNumId w:val="2"/>
-  </w:num>
-  <w:num w:numId="3" w16cid:durableId="1641038858">
+  <w:num w:numId="4" w16cid:durableId="2029794716">
     <w:abstractNumId w:val="0"/>
   </w:num>
 </w:numbering>
@@ -2088,6 +2395,178 @@
       </w:tblBorders>
     </w:tblPr>
   </w:style>
+  <w:style w:type="character" w:customStyle="1" w:styleId="ng-tns-c3396618819-174">
+    <w:name w:val="ng-tns-c3396618819-174"/>
+    <w:basedOn w:val="DefaultParagraphFont"/>
+    <w:rsid w:val="00CA13AA"/>
+  </w:style>
+  <w:style w:type="paragraph" w:styleId="HTMLPreformatted">
+    <w:name w:val="HTML Preformatted"/>
+    <w:basedOn w:val="Normal"/>
+    <w:link w:val="HTMLPreformattedChar"/>
+    <w:uiPriority w:val="99"/>
+    <w:semiHidden/>
+    <w:unhideWhenUsed/>
+    <w:rsid w:val="00CA13AA"/>
+    <w:pPr>
+      <w:tabs>
+        <w:tab w:val="left" w:pos="916"/>
+        <w:tab w:val="left" w:pos="1832"/>
+        <w:tab w:val="left" w:pos="2748"/>
+        <w:tab w:val="left" w:pos="3664"/>
+        <w:tab w:val="left" w:pos="4580"/>
+        <w:tab w:val="left" w:pos="5496"/>
+        <w:tab w:val="left" w:pos="6412"/>
+        <w:tab w:val="left" w:pos="7328"/>
+        <w:tab w:val="left" w:pos="8244"/>
+        <w:tab w:val="left" w:pos="9160"/>
+        <w:tab w:val="left" w:pos="10076"/>
+        <w:tab w:val="left" w:pos="10992"/>
+        <w:tab w:val="left" w:pos="11908"/>
+        <w:tab w:val="left" w:pos="12824"/>
+        <w:tab w:val="left" w:pos="13740"/>
+        <w:tab w:val="left" w:pos="14656"/>
+      </w:tabs>
+      <w:spacing w:after="0" w:line="240" w:lineRule="auto"/>
+    </w:pPr>
+    <w:rPr>
+      <w:rFonts w:ascii="Courier New" w:eastAsia="Times New Roman" w:hAnsi="Courier New" w:cs="Courier New"/>
+      <w:kern w:val="0"/>
+      <w:sz w:val="20"/>
+      <w:szCs w:val="20"/>
+      <w14:ligatures w14:val="none"/>
+    </w:rPr>
+  </w:style>
+  <w:style w:type="character" w:customStyle="1" w:styleId="HTMLPreformattedChar">
+    <w:name w:val="HTML Preformatted Char"/>
+    <w:basedOn w:val="DefaultParagraphFont"/>
+    <w:link w:val="HTMLPreformatted"/>
+    <w:uiPriority w:val="99"/>
+    <w:semiHidden/>
+    <w:rsid w:val="00CA13AA"/>
+    <w:rPr>
+      <w:rFonts w:ascii="Courier New" w:eastAsia="Times New Roman" w:hAnsi="Courier New" w:cs="Courier New"/>
+      <w:kern w:val="0"/>
+      <w:sz w:val="20"/>
+      <w:szCs w:val="20"/>
+      <w14:ligatures w14:val="none"/>
+    </w:rPr>
+  </w:style>
+  <w:style w:type="character" w:styleId="HTMLCode">
+    <w:name w:val="HTML Code"/>
+    <w:basedOn w:val="DefaultParagraphFont"/>
+    <w:uiPriority w:val="99"/>
+    <w:semiHidden/>
+    <w:unhideWhenUsed/>
+    <w:rsid w:val="00CA13AA"/>
+    <w:rPr>
+      <w:rFonts w:ascii="Courier New" w:eastAsia="Times New Roman" w:hAnsi="Courier New" w:cs="Courier New"/>
+      <w:sz w:val="20"/>
+      <w:szCs w:val="20"/>
+    </w:rPr>
+  </w:style>
+  <w:style w:type="character" w:customStyle="1" w:styleId="hljs-comment">
+    <w:name w:val="hljs-comment"/>
+    <w:basedOn w:val="DefaultParagraphFont"/>
+    <w:rsid w:val="00CA13AA"/>
+  </w:style>
+  <w:style w:type="character" w:customStyle="1" w:styleId="hljs-keyword">
+    <w:name w:val="hljs-keyword"/>
+    <w:basedOn w:val="DefaultParagraphFont"/>
+    <w:rsid w:val="00CA13AA"/>
+  </w:style>
+  <w:style w:type="character" w:customStyle="1" w:styleId="hljs-number">
+    <w:name w:val="hljs-number"/>
+    <w:basedOn w:val="DefaultParagraphFont"/>
+    <w:rsid w:val="00CA13AA"/>
+  </w:style>
+  <w:style w:type="character" w:customStyle="1" w:styleId="hljs-string">
+    <w:name w:val="hljs-string"/>
+    <w:basedOn w:val="DefaultParagraphFont"/>
+    <w:rsid w:val="00CA13AA"/>
+  </w:style>
+  <w:style w:type="character" w:customStyle="1" w:styleId="hljs-function">
+    <w:name w:val="hljs-function"/>
+    <w:basedOn w:val="DefaultParagraphFont"/>
+    <w:rsid w:val="00CA13AA"/>
+  </w:style>
+  <w:style w:type="character" w:customStyle="1" w:styleId="hljs-title">
+    <w:name w:val="hljs-title"/>
+    <w:basedOn w:val="DefaultParagraphFont"/>
+    <w:rsid w:val="00CA13AA"/>
+  </w:style>
+  <w:style w:type="character" w:customStyle="1" w:styleId="hljs-params">
+    <w:name w:val="hljs-params"/>
+    <w:basedOn w:val="DefaultParagraphFont"/>
+    <w:rsid w:val="00CA13AA"/>
+  </w:style>
+  <w:style w:type="character" w:customStyle="1" w:styleId="hljs-literal">
+    <w:name w:val="hljs-literal"/>
+    <w:basedOn w:val="DefaultParagraphFont"/>
+    <w:rsid w:val="00CA13AA"/>
+  </w:style>
+  <w:style w:type="character" w:customStyle="1" w:styleId="hljs-builtin">
+    <w:name w:val="hljs-built_in"/>
+    <w:basedOn w:val="DefaultParagraphFont"/>
+    <w:rsid w:val="00CA13AA"/>
+  </w:style>
+  <w:style w:type="character" w:customStyle="1" w:styleId="ng-tns-c3396618819-175">
+    <w:name w:val="ng-tns-c3396618819-175"/>
+    <w:basedOn w:val="DefaultParagraphFont"/>
+    <w:rsid w:val="00CA13AA"/>
+  </w:style>
+  <w:style w:type="paragraph" w:styleId="NormalWeb">
+    <w:name w:val="Normal (Web)"/>
+    <w:basedOn w:val="Normal"/>
+    <w:uiPriority w:val="99"/>
+    <w:semiHidden/>
+    <w:unhideWhenUsed/>
+    <w:rsid w:val="00CA13AA"/>
+    <w:pPr>
+      <w:spacing w:before="100" w:beforeAutospacing="1" w:after="100" w:afterAutospacing="1" w:line="240" w:lineRule="auto"/>
+    </w:pPr>
+    <w:rPr>
+      <w:rFonts w:ascii="Times New Roman" w:eastAsia="Times New Roman" w:hAnsi="Times New Roman" w:cs="Times New Roman"/>
+      <w:kern w:val="0"/>
+      <w14:ligatures w14:val="none"/>
+    </w:rPr>
+  </w:style>
+  <w:style w:type="character" w:customStyle="1" w:styleId="animating">
+    <w:name w:val="animating"/>
+    <w:basedOn w:val="DefaultParagraphFont"/>
+    <w:rsid w:val="00CA13AA"/>
+  </w:style>
+  <w:style w:type="paragraph" w:customStyle="1" w:styleId="animating1">
+    <w:name w:val="animating1"/>
+    <w:basedOn w:val="Normal"/>
+    <w:rsid w:val="00CA13AA"/>
+    <w:pPr>
+      <w:spacing w:before="100" w:beforeAutospacing="1" w:after="100" w:afterAutospacing="1" w:line="240" w:lineRule="auto"/>
+    </w:pPr>
+    <w:rPr>
+      <w:rFonts w:ascii="Times New Roman" w:eastAsia="Times New Roman" w:hAnsi="Times New Roman" w:cs="Times New Roman"/>
+      <w:kern w:val="0"/>
+      <w14:ligatures w14:val="none"/>
+    </w:rPr>
+  </w:style>
+  <w:style w:type="paragraph" w:customStyle="1" w:styleId="pending">
+    <w:name w:val="pending"/>
+    <w:basedOn w:val="Normal"/>
+    <w:rsid w:val="00CA13AA"/>
+    <w:pPr>
+      <w:spacing w:before="100" w:beforeAutospacing="1" w:after="100" w:afterAutospacing="1" w:line="240" w:lineRule="auto"/>
+    </w:pPr>
+    <w:rPr>
+      <w:rFonts w:ascii="Times New Roman" w:eastAsia="Times New Roman" w:hAnsi="Times New Roman" w:cs="Times New Roman"/>
+      <w:kern w:val="0"/>
+      <w14:ligatures w14:val="none"/>
+    </w:rPr>
+  </w:style>
+  <w:style w:type="character" w:customStyle="1" w:styleId="pending1">
+    <w:name w:val="pending1"/>
+    <w:basedOn w:val="DefaultParagraphFont"/>
+    <w:rsid w:val="00CA13AA"/>
+  </w:style>
 </w:styles>
 </file>
 

</xml_diff>